<commit_message>
Mẫu hợp đồng khách cá nhân: hết «Ông/Bà Ông …», bỏ ô «Ông/Bà» trùng tên khách
Tiêu đề bên khách in sẵn «Ông/Bà» nay điền {doi_tac_ho_ten} (tên bỏ danh xưng đầu);
dòng «Ông/Bà: …  Ngày sinh: …» ngay dưới chỉ còn ngày sinh. Áp cho NVO-HĐ-01→04 và
NVC-HĐ-05 (tổ đội nhận khoán).

Co-Authored-By: Claude Opus 5.5 <noreply@anthropic.com>
</commit_message>
<xml_diff>
--- a/db/seed-assets/contract-templates/NVC/NVC-HD-05_Hop_dong_giao_khoan_to_doi_nhan_cong.docx
+++ b/db/seed-assets/contract-templates/NVC/NVC-HD-05_Hop_dong_giao_khoan_to_doi_nhan_cong.docx
@@ -457,7 +457,7 @@
           <w:sz w:val="26"/>
           <w:szCs w:val="26"/>
         </w:rPr>
-        <w:t xml:space="preserve">Ông/Bà {doi_tac_ten} – Tổ trưởng tổ đội {o_8}</w:t>
+        <w:t xml:space="preserve">Ông/Bà {doi_tac_ho_ten} – Tổ trưởng tổ đội {o_8}</w:t>
       </w:r>
     </w:p>
     <w:p>
@@ -472,7 +472,7 @@
           <w:sz w:val="26"/>
           <w:szCs w:val="26"/>
         </w:rPr>
-        <w:t xml:space="preserve">Ông/Bà: {o_9}  Ngày sinh: {o_10}</w:t>
+        <w:t xml:space="preserve">Ngày sinh: {o_9}</w:t>
       </w:r>
     </w:p>
     <w:p>
@@ -487,7 +487,7 @@
           <w:sz w:val="26"/>
           <w:szCs w:val="26"/>
         </w:rPr>
-        <w:t xml:space="preserve">Số định danh cá nhân/CCCD: {o_11} cấp ngày {o_12} tại {o_13}</w:t>
+        <w:t xml:space="preserve">Số định danh cá nhân/CCCD: {o_10} cấp ngày {o_11} tại {o_12}</w:t>
       </w:r>
     </w:p>
     <w:p>
@@ -694,7 +694,7 @@
           <w:sz w:val="26"/>
           <w:szCs w:val="26"/>
         </w:rPr>
-        <w:t xml:space="preserve">1.1. Bên A giao, Bên B nhận khoán nhân công thực hiện: ☐ cốp pha – cốt thép – bê tông ☐ xây trát ☐ lắp dựng kết cấu thép ☐ lợp mái, bao che ☐ lắp đặt điện nước ☐ khác: {o_14}, theo bản vẽ thi công và chỉ dẫn của cán bộ kỹ thuật Bên A.</w:t>
+        <w:t xml:space="preserve">1.1. Bên A giao, Bên B nhận khoán nhân công thực hiện: ☐ cốp pha – cốt thép – bê tông ☐ xây trát ☐ lắp dựng kết cấu thép ☐ lợp mái, bao che ☐ lắp đặt điện nước ☐ khác: {o_13}, theo bản vẽ thi công và chỉ dẫn của cán bộ kỹ thuật Bên A.</w:t>
       </w:r>
     </w:p>
     <w:p>
@@ -708,7 +708,7 @@
           <w:sz w:val="26"/>
           <w:szCs w:val="26"/>
         </w:rPr>
-        <w:t xml:space="preserve">1.2. Vật tư chính, máy móc lớn (cẩu, máy hàn, giàn giáo {o_15}) do Bên A cung cấp. Dụng cụ cầm tay, đồ nghề, bảo hộ lao động cá nhân do ☐ Bên B tự trang bị ☐ Bên A cấp và khấu trừ.</w:t>
+        <w:t xml:space="preserve">1.2. Vật tư chính, máy móc lớn (cẩu, máy hàn, giàn giáo {o_14}) do Bên A cung cấp. Dụng cụ cầm tay, đồ nghề, bảo hộ lao động cá nhân do ☐ Bên B tự trang bị ☐ Bên A cấp và khấu trừ.</w:t>
       </w:r>
     </w:p>
     <w:p>
@@ -782,7 +782,7 @@
           <w:sz w:val="26"/>
           <w:szCs w:val="26"/>
         </w:rPr>
-        <w:t xml:space="preserve">{o_16} đồng</w:t>
+        <w:t xml:space="preserve">{o_15} đồng</w:t>
       </w:r>
       <w:r>
         <w:rPr>
@@ -859,7 +859,7 @@
           <w:sz w:val="26"/>
           <w:szCs w:val="26"/>
         </w:rPr>
-        <w:t xml:space="preserve"> (đồng/m³, đồng/m², đồng/tấn kết cấu {o_17}); thanh toán theo khối lượng thực tế được Bên A nghiệm thu.</w:t>
+        <w:t xml:space="preserve"> (đồng/m³, đồng/m², đồng/tấn kết cấu {o_16}); thanh toán theo khối lượng thực tế được Bên A nghiệm thu.</w:t>
       </w:r>
     </w:p>
     <w:p>
@@ -942,7 +942,7 @@
           <w:sz w:val="26"/>
           <w:szCs w:val="26"/>
         </w:rPr>
-        <w:t xml:space="preserve"> {o_18} đồng cho toàn bộ hạng mục {o_19}</w:t>
+        <w:t xml:space="preserve"> {o_17} đồng cho toàn bộ hạng mục {o_18}</w:t>
       </w:r>
     </w:p>
     <w:p>
@@ -984,7 +984,7 @@
           <w:sz w:val="26"/>
           <w:szCs w:val="26"/>
         </w:rPr>
-        <w:t xml:space="preserve">2.3. Công nhật phát sinh ngoài khối lượng khoán chỉ được tính khi có phiếu yêu cầu của chỉ huy trưởng Bên A: {o_20} đồng/công thợ chính; {o_21} đồng/công thợ phụ.</w:t>
+        <w:t xml:space="preserve">2.3. Công nhật phát sinh ngoài khối lượng khoán chỉ được tính khi có phiếu yêu cầu của chỉ huy trưởng Bên A: {o_19} đồng/công thợ chính; {o_20} đồng/công thợ phụ.</w:t>
       </w:r>
     </w:p>
     <w:p>
@@ -1016,7 +1016,7 @@
           <w:sz w:val="26"/>
           <w:szCs w:val="26"/>
         </w:rPr>
-        <w:t xml:space="preserve">3.1. Thời gian: từ ngày {o_22}/20{o_23} đến ngày {o_24}/20{o_25}; số người tối thiểu thường xuyên trên công trường: {o_26} người.</w:t>
+        <w:t xml:space="preserve">3.1. Thời gian: từ ngày {o_21}/20{o_22} đến ngày {o_23}/20{o_24}; số người tối thiểu thường xuyên trên công trường: {o_25} người.</w:t>
       </w:r>
     </w:p>
     <w:p>
@@ -1090,7 +1090,7 @@
           <w:sz w:val="26"/>
           <w:szCs w:val="26"/>
         </w:rPr>
-        <w:t xml:space="preserve">4.3. Định mức hao hụt vật tư cho phép: thép {o_27} %, bê tông {o_28} %, gạch {o_29} %. Vượt định mức do lỗi Bên B thì khấu trừ theo giá mua thực tế.</w:t>
+        <w:t xml:space="preserve">4.3. Định mức hao hụt vật tư cho phép: thép {o_26} %, bê tông {o_27} %, gạch {o_28} %. Vượt định mức do lỗi Bên B thì khấu trừ theo giá mua thực tế.</w:t>
       </w:r>
     </w:p>
     <w:p>
@@ -1122,7 +1122,7 @@
           <w:sz w:val="26"/>
           <w:szCs w:val="26"/>
         </w:rPr>
-        <w:t xml:space="preserve">5.1. Tạm ứng theo tuần/nửa tháng tối đa {o_30} % giá trị khối lượng đã thực hiện được cán bộ kỹ thuật xác nhận.</w:t>
+        <w:t xml:space="preserve">5.1. Tạm ứng theo tuần/nửa tháng tối đa {o_29} % giá trị khối lượng đã thực hiện được cán bộ kỹ thuật xác nhận.</w:t>
       </w:r>
     </w:p>
     <w:p>
@@ -1136,7 +1136,7 @@
           <w:sz w:val="26"/>
           <w:szCs w:val="26"/>
         </w:rPr>
-        <w:t xml:space="preserve">5.2. Thanh toán hằng tháng: {o_31} % giá trị khối lượng nghiệm thu trong tháng sau khi trừ tạm ứng; giữ lại {o_32} % để bảo đảm chất lượng.</w:t>
+        <w:t xml:space="preserve">5.2. Thanh toán hằng tháng: {o_30} % giá trị khối lượng nghiệm thu trong tháng sau khi trừ tạm ứng; giữ lại {o_31} % để bảo đảm chất lượng.</w:t>
       </w:r>
     </w:p>
     <w:p>
@@ -1150,7 +1150,7 @@
           <w:sz w:val="26"/>
           <w:szCs w:val="26"/>
         </w:rPr>
-        <w:t xml:space="preserve">5.3. Hoàn trả tiền giữ lại: ☐ khi Chủ đầu tư nghiệm thu hoàn thành hạng mục ☐ sau {o_33} tháng bảo hành.</w:t>
+        <w:t xml:space="preserve">5.3. Hoàn trả tiền giữ lại: ☐ khi Chủ đầu tư nghiệm thu hoàn thành hạng mục ☐ sau {o_32} tháng bảo hành.</w:t>
       </w:r>
     </w:p>
     <w:p>
@@ -1526,7 +1526,7 @@
           <w:sz w:val="26"/>
           <w:szCs w:val="26"/>
         </w:rPr>
-        <w:t xml:space="preserve">6.5. Vi phạm an toàn bị phạt theo Quy định an toàn công trường: {o_34} đồng/lượt; tái phạm lần ba, Bên A có quyền đình chỉ người vi phạm.</w:t>
+        <w:t xml:space="preserve">6.5. Vi phạm an toàn bị phạt theo Quy định an toàn công trường: {o_33} đồng/lượt; tái phạm lần ba, Bên A có quyền đình chỉ người vi phạm.</w:t>
       </w:r>
     </w:p>
     <w:p>
@@ -1604,7 +1604,7 @@
           <w:sz w:val="26"/>
           <w:szCs w:val="26"/>
         </w:rPr>
-        <w:t xml:space="preserve">8.1. Chậm tiến độ do lỗi Bên B: phạt {o_35} % giá trị phần việc chậm/ngày, tối đa {o_36} %.</w:t>
+        <w:t xml:space="preserve">8.1. Chậm tiến độ do lỗi Bên B: phạt {o_34} % giá trị phần việc chậm/ngày, tối đa {o_35} %.</w:t>
       </w:r>
     </w:p>
     <w:p>
@@ -1618,7 +1618,7 @@
           <w:sz w:val="26"/>
           <w:szCs w:val="26"/>
         </w:rPr>
-        <w:t xml:space="preserve">8.2. Bên A có quyền chấm dứt hợp đồng, thanh toán phần đã nghiệm thu sau khi trừ các khoản phạt, bồi thường, nếu Bên B: bỏ công trình quá {o_37} ngày; chất lượng không đạt lặp lại; vi phạm an toàn nghiêm trọng; tự ý giao lại cho tổ đội khác.</w:t>
+        <w:t xml:space="preserve">8.2. Bên A có quyền chấm dứt hợp đồng, thanh toán phần đã nghiệm thu sau khi trừ các khoản phạt, bồi thường, nếu Bên B: bỏ công trình quá {o_36} ngày; chất lượng không đạt lặp lại; vi phạm an toàn nghiêm trọng; tự ý giao lại cho tổ đội khác.</w:t>
       </w:r>
     </w:p>
     <w:p>
@@ -1632,7 +1632,7 @@
           <w:sz w:val="26"/>
           <w:szCs w:val="26"/>
         </w:rPr>
-        <w:t xml:space="preserve">8.3. Bên B có quyền chấm dứt hợp đồng nếu Bên A chậm thanh toán quá {o_38} ngày.</w:t>
+        <w:t xml:space="preserve">8.3. Bên B có quyền chấm dứt hợp đồng nếu Bên A chậm thanh toán quá {o_37} ngày.</w:t>
       </w:r>
     </w:p>
     <w:p>

</xml_diff>